<commit_message>
Update project doc. - Task 4
</commit_message>
<xml_diff>
--- a/DB-Course Project.docx
+++ b/DB-Course Project.docx
@@ -471,7 +471,6 @@
                         <w:dataBinding w:prefixMappings="xmlns:ns0='http://purl.org/dc/elements/1.1/' xmlns:ns1='http://schemas.openxmlformats.org/package/2006/metadata/core-properties' " w:xpath="/ns1:coreProperties[1]/ns0:title[1]" w:storeItemID="{6C3C8BC8-F283-45AE-878A-BAB7291924A1}"/>
                         <w:text/>
                       </w:sdtPr>
-                      <w:sdtEndPr/>
                       <w:sdtContent>
                         <w:p>
                           <w:pPr>
@@ -529,7 +528,6 @@
                           <w:dataBinding w:prefixMappings="xmlns:ns0='http://purl.org/dc/elements/1.1/' xmlns:ns1='http://schemas.openxmlformats.org/package/2006/metadata/core-properties' " w:xpath="/ns1:coreProperties[1]/ns0:subject[1]" w:storeItemID="{6C3C8BC8-F283-45AE-878A-BAB7291924A1}"/>
                           <w:text/>
                         </w:sdtPr>
-                        <w:sdtEndPr/>
                         <w:sdtContent>
                           <w:r>
                             <w:rPr>
@@ -772,7 +770,6 @@
                         <w:dataBinding w:prefixMappings="xmlns:ns0='http://schemas.microsoft.com/office/2006/coverPageProps'" w:xpath="/ns0:CoverPageProperties[1]/ns0:Abstract[1]" w:storeItemID="{55AF091B-3C7A-41E3-B477-F2FDAA23CFDA}"/>
                         <w:text/>
                       </w:sdtPr>
-                      <w:sdtEndPr/>
                       <w:sdtContent>
                         <w:p>
                           <w:pPr>
@@ -1010,11 +1007,7 @@
           </mc:Choice>
           <mc:Fallback>
             <w:pict>
-              <v:shapetype w14:anchorId="6466823C" id="_x0000_t202" coordsize="21600,21600" o:spt="202" path="m,l,21600r21600,l21600,xe">
-                <v:stroke joinstyle="miter"/>
-                <v:path gradientshapeok="t" o:connecttype="rect"/>
-              </v:shapetype>
-              <v:shape id="Text Box 2" o:spid="_x0000_s1027" type="#_x0000_t202" style="position:absolute;margin-left:40.3pt;margin-top:.05pt;width:545.45pt;height:87.55pt;z-index:251679744;visibility:visible;mso-wrap-style:square;mso-width-percent:0;mso-height-percent:0;mso-wrap-distance-left:9pt;mso-wrap-distance-top:7.2pt;mso-wrap-distance-right:9pt;mso-wrap-distance-bottom:7.2pt;mso-position-horizontal:absolute;mso-position-horizontal-relative:page;mso-position-vertical:absolute;mso-position-vertical-relative:text;mso-width-percent:0;mso-height-percent:0;mso-width-relative:margin;mso-height-relative:margin;v-text-anchor:top" o:gfxdata="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" filled="f" stroked="f">
+              <v:shape w14:anchorId="6466823C" id="Text Box 2" o:spid="_x0000_s1027" type="#_x0000_t202" style="position:absolute;margin-left:40.3pt;margin-top:.05pt;width:545.45pt;height:87.55pt;z-index:251679744;visibility:visible;mso-wrap-style:square;mso-width-percent:0;mso-height-percent:0;mso-wrap-distance-left:9pt;mso-wrap-distance-top:7.2pt;mso-wrap-distance-right:9pt;mso-wrap-distance-bottom:7.2pt;mso-position-horizontal:absolute;mso-position-horizontal-relative:page;mso-position-vertical:absolute;mso-position-vertical-relative:text;mso-width-percent:0;mso-height-percent:0;mso-width-relative:margin;mso-height-relative:margin;v-text-anchor:top" o:gfxdata="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" filled="f" stroked="f">
                 <v:textbox>
                   <w:txbxContent>
                     <w:p>
@@ -2665,11 +2658,7 @@
               </mc:Choice>
               <mc:Fallback>
                 <w:pict>
-                  <v:shapetype w14:anchorId="7CBAAF0B" id="_x0000_t202" coordsize="21600,21600" o:spt="202" path="m,l,21600r21600,l21600,xe">
-                    <v:stroke joinstyle="miter"/>
-                    <v:path gradientshapeok="t" o:connecttype="rect"/>
-                  </v:shapetype>
-                  <v:shape id="Text Box 15" o:spid="_x0000_s1031" type="#_x0000_t202" alt="contact info" style="position:absolute;margin-left:36pt;margin-top:228.75pt;width:540pt;height:99.75pt;z-index:251675648;visibility:visible;mso-wrap-style:square;mso-width-percent:1282;mso-height-percent:0;mso-wrap-distance-left:9pt;mso-wrap-distance-top:0;mso-wrap-distance-right:9pt;mso-wrap-distance-bottom:0;mso-position-horizontal:absolute;mso-position-horizontal-relative:page;mso-position-vertical:absolute;mso-position-vertical-relative:margin;mso-width-percent:1282;mso-height-percent:0;mso-width-relative:margin;mso-height-relative:margin;v-text-anchor:bottom" o:gfxdata="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" o:allowoverlap="f" filled="f" stroked="f" strokeweight=".5pt">
+                  <v:shape w14:anchorId="7CBAAF0B" id="Text Box 15" o:spid="_x0000_s1031" type="#_x0000_t202" alt="contact info" style="position:absolute;margin-left:36pt;margin-top:228.75pt;width:540pt;height:99.75pt;z-index:251675648;visibility:visible;mso-wrap-style:square;mso-width-percent:1282;mso-height-percent:0;mso-wrap-distance-left:9pt;mso-wrap-distance-top:0;mso-wrap-distance-right:9pt;mso-wrap-distance-bottom:0;mso-position-horizontal:absolute;mso-position-horizontal-relative:page;mso-position-vertical:absolute;mso-position-vertical-relative:margin;mso-width-percent:1282;mso-height-percent:0;mso-width-relative:margin;mso-height-relative:margin;v-text-anchor:bottom" o:gfxdata="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" o:allowoverlap="f" filled="f" stroked="f" strokeweight=".5pt">
                     <v:textbox inset="0,0,0,0">
                       <w:txbxContent>
                         <w:p>
@@ -4071,25 +4060,7 @@
           <w:sz w:val="24"/>
           <w:szCs w:val="24"/>
         </w:rPr>
-        <w:t xml:space="preserve"> to the live report document, GitHub/GitLab repository, and Google </w:t>
-      </w:r>
-      <w:proofErr w:type="spellStart"/>
-      <w:r>
-        <w:rPr>
-          <w:rFonts w:ascii="Times New Roman" w:hAnsi="Times New Roman" w:cs="Times New Roman"/>
-          <w:sz w:val="24"/>
-          <w:szCs w:val="24"/>
-        </w:rPr>
-        <w:t>Colab</w:t>
-      </w:r>
-      <w:proofErr w:type="spellEnd"/>
-      <w:r>
-        <w:rPr>
-          <w:rFonts w:ascii="Times New Roman" w:hAnsi="Times New Roman" w:cs="Times New Roman"/>
-          <w:sz w:val="24"/>
-          <w:szCs w:val="24"/>
-        </w:rPr>
-        <w:t xml:space="preserve"> notebook (if applicable) in the </w:t>
+        <w:t xml:space="preserve"> to the live report document, GitHub/GitLab repository, and Google Colab notebook (if applicable) in the </w:t>
       </w:r>
       <w:r>
         <w:rPr>
@@ -4845,27 +4816,7 @@
           <w:szCs w:val="24"/>
           <w:lang w:val="es-ES"/>
         </w:rPr>
-        <w:t xml:space="preserve">A complete ER/EER </w:t>
-      </w:r>
-      <w:proofErr w:type="spellStart"/>
-      <w:r>
-        <w:rPr>
-          <w:rFonts w:ascii="Times New Roman" w:hAnsi="Times New Roman" w:cs="Times New Roman"/>
-          <w:sz w:val="24"/>
-          <w:szCs w:val="24"/>
-          <w:lang w:val="es-ES"/>
-        </w:rPr>
-        <w:t>diagram</w:t>
-      </w:r>
-      <w:proofErr w:type="spellEnd"/>
-      <w:r>
-        <w:rPr>
-          <w:rFonts w:ascii="Times New Roman" w:hAnsi="Times New Roman" w:cs="Times New Roman"/>
-          <w:sz w:val="24"/>
-          <w:szCs w:val="24"/>
-          <w:lang w:val="es-ES"/>
-        </w:rPr>
-        <w:t>.</w:t>
+        <w:t>A complete ER/EER diagram.</w:t>
       </w:r>
     </w:p>
     <w:p>
@@ -5325,8 +5276,9 @@
         <w:pStyle w:val="ListBullet"/>
         <w:numPr>
           <w:ilvl w:val="0"/>
-          <w:numId w:val="25"/>
+          <w:numId w:val="0"/>
         </w:numPr>
+        <w:ind w:left="351"/>
         <w:jc w:val="both"/>
         <w:rPr>
           <w:rFonts w:ascii="Times New Roman" w:hAnsi="Times New Roman" w:cs="Times New Roman"/>
@@ -5348,8 +5300,9 @@
         <w:pStyle w:val="ListBullet"/>
         <w:numPr>
           <w:ilvl w:val="0"/>
-          <w:numId w:val="25"/>
+          <w:numId w:val="0"/>
         </w:numPr>
+        <w:ind w:left="351"/>
         <w:jc w:val="both"/>
         <w:rPr>
           <w:rFonts w:ascii="Times New Roman" w:hAnsi="Times New Roman" w:cs="Times New Roman"/>
@@ -5371,8 +5324,9 @@
         <w:pStyle w:val="ListBullet"/>
         <w:numPr>
           <w:ilvl w:val="0"/>
-          <w:numId w:val="25"/>
+          <w:numId w:val="0"/>
         </w:numPr>
+        <w:ind w:left="351"/>
         <w:jc w:val="both"/>
         <w:rPr>
           <w:rFonts w:ascii="Times New Roman" w:hAnsi="Times New Roman" w:cs="Times New Roman"/>
@@ -5394,8 +5348,9 @@
         <w:pStyle w:val="ListBullet"/>
         <w:numPr>
           <w:ilvl w:val="0"/>
-          <w:numId w:val="25"/>
+          <w:numId w:val="0"/>
         </w:numPr>
+        <w:ind w:left="351"/>
         <w:jc w:val="both"/>
         <w:rPr>
           <w:rFonts w:ascii="Times New Roman" w:hAnsi="Times New Roman" w:cs="Times New Roman"/>
@@ -5415,11 +5370,8 @@
     <w:p>
       <w:pPr>
         <w:pStyle w:val="NormalWeb"/>
-        <w:numPr>
-          <w:ilvl w:val="0"/>
-          <w:numId w:val="25"/>
-        </w:numPr>
         <w:spacing w:before="160" w:beforeAutospacing="0" w:after="0" w:afterAutospacing="0"/>
+        <w:ind w:left="351"/>
         <w:jc w:val="both"/>
       </w:pPr>
       <w:r>
@@ -5434,11 +5386,8 @@
     <w:p>
       <w:pPr>
         <w:pStyle w:val="NormalWeb"/>
-        <w:numPr>
-          <w:ilvl w:val="0"/>
-          <w:numId w:val="25"/>
-        </w:numPr>
         <w:spacing w:before="160" w:beforeAutospacing="0" w:after="0" w:afterAutospacing="0"/>
+        <w:ind w:left="351"/>
         <w:jc w:val="both"/>
       </w:pPr>
       <w:r>
@@ -5453,171 +5402,36 @@
     <w:p>
       <w:pPr>
         <w:pStyle w:val="NormalWeb"/>
-        <w:numPr>
-          <w:ilvl w:val="0"/>
-          <w:numId w:val="25"/>
-        </w:numPr>
         <w:spacing w:before="160" w:beforeAutospacing="0" w:after="0" w:afterAutospacing="0"/>
+        <w:ind w:left="351"/>
         <w:jc w:val="both"/>
       </w:pPr>
       <w:r>
         <w:rPr>
           <w:color w:val="595959"/>
         </w:rPr>
-        <w:t xml:space="preserve">One of the main challenges I faced was converting the specialization between </w:t>
-      </w:r>
-      <w:proofErr w:type="spellStart"/>
-      <w:r>
-        <w:rPr>
-          <w:color w:val="595959"/>
-        </w:rPr>
-        <w:t>ClinicPerson</w:t>
-      </w:r>
-      <w:proofErr w:type="spellEnd"/>
-      <w:r>
-        <w:rPr>
-          <w:color w:val="595959"/>
-        </w:rPr>
-        <w:t>, Patient, and Doctor into relational tables without duplicating shared information. At first, the original design stored names, phone numbers, and email addresses separately in both the Patient and Doctor tables. This created unnecessary repetition and could lead to inconsistent data. I identified the issue while mapping the EER diagram into the relational model because the same personal attributes appeared in two entities.</w:t>
+        <w:t>One of the main challenges I faced was converting the specialization between ClinicPerson, Patient, and Doctor into relational tables without duplicating shared information. At first, the original design stored names, phone numbers, and email addresses separately in both the Patient and Doctor tables. This created unnecessary repetition and could lead to inconsistent data. I identified the issue while mapping the EER diagram into the relational model because the same personal attributes appeared in two entities.</w:t>
       </w:r>
     </w:p>
     <w:p>
       <w:pPr>
         <w:pStyle w:val="NormalWeb"/>
-        <w:numPr>
-          <w:ilvl w:val="0"/>
-          <w:numId w:val="25"/>
-        </w:numPr>
         <w:spacing w:before="160" w:beforeAutospacing="0" w:after="0" w:afterAutospacing="0"/>
+        <w:ind w:left="351"/>
         <w:jc w:val="both"/>
       </w:pPr>
       <w:r>
         <w:rPr>
           <w:color w:val="595959"/>
         </w:rPr>
-        <w:t xml:space="preserve">To resolve it, I created a </w:t>
-      </w:r>
-      <w:proofErr w:type="spellStart"/>
-      <w:r>
-        <w:rPr>
-          <w:color w:val="595959"/>
-        </w:rPr>
-        <w:t>ClinicPerson</w:t>
-      </w:r>
-      <w:proofErr w:type="spellEnd"/>
-      <w:r>
-        <w:rPr>
-          <w:color w:val="595959"/>
-        </w:rPr>
-        <w:t xml:space="preserve"> superclass containing </w:t>
-      </w:r>
-      <w:proofErr w:type="spellStart"/>
-      <w:r>
-        <w:rPr>
-          <w:color w:val="595959"/>
-        </w:rPr>
-        <w:t>PersonID</w:t>
-      </w:r>
-      <w:proofErr w:type="spellEnd"/>
-      <w:r>
-        <w:rPr>
-          <w:color w:val="595959"/>
-        </w:rPr>
-        <w:t xml:space="preserve">, </w:t>
-      </w:r>
-      <w:proofErr w:type="spellStart"/>
-      <w:r>
-        <w:rPr>
-          <w:color w:val="595959"/>
-        </w:rPr>
-        <w:t>FullName</w:t>
-      </w:r>
-      <w:proofErr w:type="spellEnd"/>
-      <w:r>
-        <w:rPr>
-          <w:color w:val="595959"/>
-        </w:rPr>
-        <w:t xml:space="preserve">, Phone, and Email. The Patient and Doctor tables were then implemented as subclasses. Their identifiers became both primary keys and foreign keys referencing </w:t>
-      </w:r>
-      <w:proofErr w:type="spellStart"/>
-      <w:r>
-        <w:rPr>
-          <w:color w:val="595959"/>
-        </w:rPr>
-        <w:t>ClinicPerson.PersonID</w:t>
-      </w:r>
-      <w:proofErr w:type="spellEnd"/>
-      <w:r>
-        <w:rPr>
-          <w:color w:val="595959"/>
-        </w:rPr>
-        <w:t xml:space="preserve">. Patient-specific attributes, such as </w:t>
-      </w:r>
-      <w:proofErr w:type="spellStart"/>
-      <w:r>
-        <w:rPr>
-          <w:color w:val="595959"/>
-        </w:rPr>
-        <w:t>NationalID</w:t>
-      </w:r>
-      <w:proofErr w:type="spellEnd"/>
-      <w:r>
-        <w:rPr>
-          <w:color w:val="595959"/>
-        </w:rPr>
-        <w:t xml:space="preserve">, </w:t>
-      </w:r>
-      <w:proofErr w:type="spellStart"/>
-      <w:r>
-        <w:rPr>
-          <w:color w:val="595959"/>
-        </w:rPr>
-        <w:t>BirthDate</w:t>
-      </w:r>
-      <w:proofErr w:type="spellEnd"/>
-      <w:r>
-        <w:rPr>
-          <w:color w:val="595959"/>
-        </w:rPr>
-        <w:t xml:space="preserve">, and Address, remained in Patient, while Specialty and </w:t>
-      </w:r>
-      <w:proofErr w:type="spellStart"/>
-      <w:r>
-        <w:rPr>
-          <w:color w:val="595959"/>
-        </w:rPr>
-        <w:t>LicenseNo</w:t>
-      </w:r>
-      <w:proofErr w:type="spellEnd"/>
-      <w:r>
-        <w:rPr>
-          <w:color w:val="595959"/>
-        </w:rPr>
-        <w:t xml:space="preserve"> remained in Doctor. I also tested the insertion order to confirm that a </w:t>
-      </w:r>
-      <w:proofErr w:type="spellStart"/>
-      <w:r>
-        <w:rPr>
-          <w:color w:val="595959"/>
-        </w:rPr>
-        <w:t>ClinicPerson</w:t>
-      </w:r>
-      <w:proofErr w:type="spellEnd"/>
-      <w:r>
-        <w:rPr>
-          <w:color w:val="595959"/>
-        </w:rPr>
-        <w:t xml:space="preserve"> record had to exist before its related subclass record could be inserted.</w:t>
+        <w:t>To resolve it, I created a ClinicPerson superclass containing PersonID, FullName, Phone, and Email. The Patient and Doctor tables were then implemented as subclasses. Their identifiers became both primary keys and foreign keys referencing ClinicPerson.PersonID. Patient-specific attributes, such as NationalID, BirthDate, and Address, remained in Patient, while Specialty and LicenseNo remained in Doctor. I also tested the insertion order to confirm that a ClinicPerson record had to exist before its related subclass record could be inserted.</w:t>
       </w:r>
     </w:p>
     <w:p>
       <w:pPr>
         <w:pStyle w:val="NormalWeb"/>
-        <w:numPr>
-          <w:ilvl w:val="0"/>
-          <w:numId w:val="25"/>
-        </w:numPr>
         <w:spacing w:before="160" w:beforeAutospacing="0" w:after="0" w:afterAutospacing="0"/>
+        <w:ind w:left="351"/>
         <w:jc w:val="both"/>
       </w:pPr>
       <w:r>
@@ -5632,52 +5446,37 @@
     <w:p>
       <w:pPr>
         <w:pStyle w:val="NormalWeb"/>
-        <w:numPr>
-          <w:ilvl w:val="0"/>
-          <w:numId w:val="25"/>
-        </w:numPr>
         <w:spacing w:before="160" w:beforeAutospacing="0" w:after="0" w:afterAutospacing="0"/>
+        <w:ind w:left="351"/>
         <w:jc w:val="both"/>
       </w:pPr>
       <w:r>
         <w:rPr>
           <w:color w:val="595959"/>
         </w:rPr>
-        <w:t xml:space="preserve">I chose the superclass–subclass approach instead of creating two completely independent Patient and Doctor tables. The main advantage was reduced </w:t>
-      </w:r>
-      <w:r>
-        <w:rPr>
-          <w:color w:val="595959"/>
-        </w:rPr>
-        <w:lastRenderedPageBreak/>
-        <w:t>duplication and clearer representation of the EER specialization. It also allowed shared constraints, such as unique email addresses, to be controlled in one place.</w:t>
+        <w:t>I chose the superclass–subclass approach instead of creating two completely independent Patient and Doctor tables. The main advantage was reduced duplication and clearer representation of the EER specialization. It also allowed shared constraints, such as unique email addresses, to be controlled in one place.</w:t>
       </w:r>
     </w:p>
     <w:p>
       <w:pPr>
         <w:pStyle w:val="NormalWeb"/>
-        <w:numPr>
-          <w:ilvl w:val="0"/>
-          <w:numId w:val="25"/>
-        </w:numPr>
         <w:spacing w:before="160" w:beforeAutospacing="0" w:after="0" w:afterAutospacing="0"/>
+        <w:ind w:left="351"/>
         <w:jc w:val="both"/>
       </w:pPr>
       <w:r>
         <w:rPr>
           <w:color w:val="595959"/>
         </w:rPr>
+        <w:lastRenderedPageBreak/>
         <w:t>The alternative would have been simpler because each table could store all required attributes directly. However, that design would repeat personal details and make future changes harder. The selected method required additional joins when retrieving names and introduced a more complex insertion process, but these disadvantages were acceptable because the database became more normalized and consistent.</w:t>
       </w:r>
     </w:p>
     <w:p>
       <w:pPr>
         <w:pStyle w:val="NormalWeb"/>
-        <w:numPr>
-          <w:ilvl w:val="0"/>
-          <w:numId w:val="25"/>
-        </w:numPr>
         <w:spacing w:before="160" w:beforeAutospacing="0" w:after="0" w:afterAutospacing="0"/>
+        <w:ind w:left="351"/>
         <w:jc w:val="both"/>
       </w:pPr>
       <w:r>
@@ -5692,11 +5491,8 @@
     <w:p>
       <w:pPr>
         <w:pStyle w:val="NormalWeb"/>
-        <w:numPr>
-          <w:ilvl w:val="0"/>
-          <w:numId w:val="25"/>
-        </w:numPr>
         <w:spacing w:before="160" w:beforeAutospacing="0" w:after="0" w:afterAutospacing="0"/>
+        <w:ind w:left="351"/>
         <w:jc w:val="both"/>
       </w:pPr>
       <w:r>
@@ -5709,11 +5505,8 @@
     <w:p>
       <w:pPr>
         <w:pStyle w:val="NormalWeb"/>
-        <w:numPr>
-          <w:ilvl w:val="0"/>
-          <w:numId w:val="25"/>
-        </w:numPr>
         <w:spacing w:before="160" w:beforeAutospacing="0" w:after="0" w:afterAutospacing="0"/>
+        <w:ind w:left="351"/>
         <w:jc w:val="both"/>
       </w:pPr>
       <w:r>
@@ -5728,11 +5521,8 @@
     <w:p>
       <w:pPr>
         <w:pStyle w:val="NormalWeb"/>
-        <w:numPr>
-          <w:ilvl w:val="0"/>
-          <w:numId w:val="25"/>
-        </w:numPr>
         <w:spacing w:before="160" w:beforeAutospacing="0" w:after="0" w:afterAutospacing="0"/>
+        <w:ind w:left="351"/>
         <w:jc w:val="both"/>
       </w:pPr>
       <w:r>
@@ -5820,29 +5610,7 @@
           <w:sz w:val="24"/>
           <w:szCs w:val="24"/>
         </w:rPr>
-        <w:t>SQL Script (.</w:t>
-      </w:r>
-      <w:proofErr w:type="spellStart"/>
-      <w:r>
-        <w:rPr>
-          <w:rFonts w:ascii="Times New Roman" w:hAnsi="Times New Roman" w:cs="Times New Roman"/>
-          <w:b/>
-          <w:bCs/>
-          <w:sz w:val="24"/>
-          <w:szCs w:val="24"/>
-        </w:rPr>
-        <w:t>sql</w:t>
-      </w:r>
-      <w:proofErr w:type="spellEnd"/>
-      <w:r>
-        <w:rPr>
-          <w:rFonts w:ascii="Times New Roman" w:hAnsi="Times New Roman" w:cs="Times New Roman"/>
-          <w:b/>
-          <w:bCs/>
-          <w:sz w:val="24"/>
-          <w:szCs w:val="24"/>
-        </w:rPr>
-        <w:t>)</w:t>
+        <w:t>SQL Script (.sql)</w:t>
       </w:r>
       <w:r>
         <w:rPr>
@@ -6012,25 +5780,7 @@
           <w:sz w:val="24"/>
           <w:szCs w:val="24"/>
         </w:rPr>
-        <w:t xml:space="preserve">Google </w:t>
-      </w:r>
-      <w:proofErr w:type="spellStart"/>
-      <w:r>
-        <w:rPr>
-          <w:rFonts w:ascii="Times New Roman" w:hAnsi="Times New Roman" w:cs="Times New Roman"/>
-          <w:sz w:val="24"/>
-          <w:szCs w:val="24"/>
-        </w:rPr>
-        <w:t>Colab</w:t>
-      </w:r>
-      <w:proofErr w:type="spellEnd"/>
-      <w:r>
-        <w:rPr>
-          <w:rFonts w:ascii="Times New Roman" w:hAnsi="Times New Roman" w:cs="Times New Roman"/>
-          <w:sz w:val="24"/>
-          <w:szCs w:val="24"/>
-        </w:rPr>
-        <w:t xml:space="preserve"> notebook (if applicable): [link]</w:t>
+        <w:t>Google Colab notebook (if applicable): [link]</w:t>
       </w:r>
     </w:p>
     <w:p>
@@ -10969,6 +10719,8 @@
     <w:rsid w:val="002A69BE"/>
     <w:rsid w:val="00324ACF"/>
     <w:rsid w:val="00351A43"/>
+    <w:rsid w:val="003A0995"/>
+    <w:rsid w:val="003B49E9"/>
     <w:rsid w:val="004A7EE6"/>
     <w:rsid w:val="004E5C8C"/>
     <w:rsid w:val="005443A0"/>
@@ -11841,16 +11593,16 @@
 </file>
 
 <file path=customXml/item2.xml><?xml version="1.0" encoding="utf-8"?>
-<b:Sources xmlns:b="http://schemas.openxmlformats.org/officeDocument/2006/bibliography" SelectedStyle="\APA.XSL" StyleName="APA"/>
-</file>
-
-<file path=customXml/item3.xml><?xml version="1.0" encoding="utf-8"?>
 <?mso-contentType ?>
 <FormTemplates xmlns="http://schemas.microsoft.com/sharepoint/v3/contenttype/forms">
   <Display>DocumentLibraryForm</Display>
   <Edit>AssetEditForm</Edit>
   <New>DocumentLibraryForm</New>
 </FormTemplates>
+</file>
+
+<file path=customXml/item3.xml><?xml version="1.0" encoding="utf-8"?>
+<b:Sources xmlns:b="http://schemas.openxmlformats.org/officeDocument/2006/bibliography" SelectedStyle="\APA.XSL" StyleName="APA"/>
 </file>
 
 <file path=customXml/itemProps1.xml><?xml version="1.0" encoding="utf-8"?>
@@ -11862,17 +11614,17 @@
 </file>
 
 <file path=customXml/itemProps2.xml><?xml version="1.0" encoding="utf-8"?>
+<ds:datastoreItem xmlns:ds="http://schemas.openxmlformats.org/officeDocument/2006/customXml" ds:itemID="{E34C63B7-A026-4A37-9535-4FBB4C03A11D}">
+  <ds:schemaRefs>
+    <ds:schemaRef ds:uri="http://schemas.microsoft.com/sharepoint/v3/contenttype/forms"/>
+  </ds:schemaRefs>
+</ds:datastoreItem>
+</file>
+
+<file path=customXml/itemProps3.xml><?xml version="1.0" encoding="utf-8"?>
 <ds:datastoreItem xmlns:ds="http://schemas.openxmlformats.org/officeDocument/2006/customXml" ds:itemID="{355C5113-D031-41DB-A6D8-43CE1A0E6695}">
   <ds:schemaRefs>
     <ds:schemaRef ds:uri="http://schemas.openxmlformats.org/officeDocument/2006/bibliography"/>
   </ds:schemaRefs>
 </ds:datastoreItem>
-</file>
-
-<file path=customXml/itemProps3.xml><?xml version="1.0" encoding="utf-8"?>
-<ds:datastoreItem xmlns:ds="http://schemas.openxmlformats.org/officeDocument/2006/customXml" ds:itemID="{E34C63B7-A026-4A37-9535-4FBB4C03A11D}">
-  <ds:schemaRefs>
-    <ds:schemaRef ds:uri="http://schemas.microsoft.com/sharepoint/v3/contenttype/forms"/>
-  </ds:schemaRefs>
-</ds:datastoreItem>
 </file>
</xml_diff>